<commit_message>
New log: Google Gemini prompts
</commit_message>
<xml_diff>
--- a/Logs.docx
+++ b/Logs.docx
@@ -52,42 +52,259 @@
     <w:p>
       <w:pPr>
         <w:spacing w:before="0" w:beforeAutospacing="off" w:after="240" w:afterAutospacing="off"/>
-      </w:pPr>
-      <w:r>
-        <w:rPr>
-          <w:rFonts w:ascii="Segoe UI" w:hAnsi="Segoe UI" w:eastAsia="Segoe UI" w:cs="Segoe UI"/>
-          <w:b w:val="0"/>
-          <w:bCs w:val="0"/>
-          <w:i w:val="0"/>
-          <w:iCs w:val="0"/>
-          <w:caps w:val="0"/>
-          <w:smallCaps w:val="0"/>
-          <w:noProof w:val="0"/>
-          <w:color w:val="auto"/>
-          <w:sz w:val="19"/>
-          <w:szCs w:val="19"/>
-          <w:lang w:val="en-US"/>
-        </w:rPr>
-        <w:t>Tool: Claude in VS Code</w:t>
+        <w:rPr>
+          <w:rFonts w:ascii="Segoe UI" w:hAnsi="Segoe UI" w:eastAsia="Segoe UI" w:cs="Segoe UI"/>
+          <w:b w:val="1"/>
+          <w:bCs w:val="1"/>
+          <w:i w:val="0"/>
+          <w:iCs w:val="0"/>
+          <w:caps w:val="0"/>
+          <w:smallCaps w:val="0"/>
+          <w:noProof w:val="0"/>
+          <w:color w:val="FF0000"/>
+          <w:sz w:val="19"/>
+          <w:szCs w:val="19"/>
+          <w:lang w:val="en-US"/>
+        </w:rPr>
+      </w:pPr>
+      <w:r>
+        <w:rPr>
+          <w:rFonts w:ascii="Segoe UI" w:hAnsi="Segoe UI" w:eastAsia="Segoe UI" w:cs="Segoe UI"/>
+          <w:b w:val="1"/>
+          <w:bCs w:val="1"/>
+          <w:i w:val="0"/>
+          <w:iCs w:val="0"/>
+          <w:caps w:val="0"/>
+          <w:smallCaps w:val="0"/>
+          <w:noProof w:val="0"/>
+          <w:color w:val="FF0000"/>
+          <w:sz w:val="20"/>
+          <w:szCs w:val="20"/>
+          <w:lang w:val="en-US"/>
+        </w:rPr>
+        <w:t xml:space="preserve">Tool: </w:t>
+      </w:r>
+      <w:r>
+        <w:rPr>
+          <w:rFonts w:ascii="Segoe UI" w:hAnsi="Segoe UI" w:eastAsia="Segoe UI" w:cs="Segoe UI"/>
+          <w:b w:val="1"/>
+          <w:bCs w:val="1"/>
+          <w:i w:val="0"/>
+          <w:iCs w:val="0"/>
+          <w:caps w:val="0"/>
+          <w:smallCaps w:val="0"/>
+          <w:noProof w:val="0"/>
+          <w:color w:val="FF0000"/>
+          <w:sz w:val="19"/>
+          <w:szCs w:val="19"/>
+          <w:lang w:val="en-US"/>
+        </w:rPr>
+        <w:t>Claude in VS Code</w:t>
       </w:r>
     </w:p>
     <w:p>
       <w:pPr>
         <w:spacing w:before="0" w:beforeAutospacing="off" w:after="240" w:afterAutospacing="off"/>
-      </w:pPr>
-      <w:r>
-        <w:rPr>
-          <w:rFonts w:ascii="Segoe UI" w:hAnsi="Segoe UI" w:eastAsia="Segoe UI" w:cs="Segoe UI"/>
-          <w:b w:val="0"/>
-          <w:bCs w:val="0"/>
-          <w:i w:val="0"/>
-          <w:iCs w:val="0"/>
-          <w:caps w:val="0"/>
-          <w:smallCaps w:val="0"/>
-          <w:noProof w:val="0"/>
-          <w:color w:val="auto"/>
-          <w:sz w:val="19"/>
-          <w:szCs w:val="19"/>
+        <w:rPr>
+          <w:rFonts w:ascii="Segoe UI" w:hAnsi="Segoe UI" w:eastAsia="Segoe UI" w:cs="Segoe UI"/>
+          <w:b w:val="0"/>
+          <w:bCs w:val="0"/>
+          <w:i w:val="0"/>
+          <w:iCs w:val="0"/>
+          <w:caps w:val="0"/>
+          <w:smallCaps w:val="0"/>
+          <w:noProof w:val="0"/>
+          <w:color w:val="auto"/>
+          <w:sz w:val="19"/>
+          <w:szCs w:val="19"/>
+          <w:lang w:val="en-US"/>
+        </w:rPr>
+      </w:pPr>
+      <w:r>
+        <w:rPr>
+          <w:rFonts w:ascii="Segoe UI" w:hAnsi="Segoe UI" w:eastAsia="Segoe UI" w:cs="Segoe UI"/>
+          <w:b w:val="1"/>
+          <w:bCs w:val="1"/>
+          <w:i w:val="0"/>
+          <w:iCs w:val="0"/>
+          <w:caps w:val="0"/>
+          <w:smallCaps w:val="0"/>
+          <w:noProof w:val="0"/>
+          <w:color w:val="auto"/>
+          <w:sz w:val="20"/>
+          <w:szCs w:val="20"/>
+          <w:lang w:val="en-US"/>
+        </w:rPr>
+        <w:t>Goal:</w:t>
+      </w:r>
+      <w:r>
+        <w:rPr>
+          <w:rFonts w:ascii="Segoe UI" w:hAnsi="Segoe UI" w:eastAsia="Segoe UI" w:cs="Segoe UI"/>
+          <w:b w:val="0"/>
+          <w:bCs w:val="0"/>
+          <w:i w:val="0"/>
+          <w:iCs w:val="0"/>
+          <w:caps w:val="0"/>
+          <w:smallCaps w:val="0"/>
+          <w:noProof w:val="0"/>
+          <w:color w:val="auto"/>
+          <w:sz w:val="19"/>
+          <w:szCs w:val="19"/>
+          <w:lang w:val="en-US"/>
+        </w:rPr>
+        <w:t xml:space="preserve"> </w:t>
+      </w:r>
+      <w:r>
+        <w:rPr>
+          <w:rFonts w:ascii="Segoe UI" w:hAnsi="Segoe UI" w:eastAsia="Segoe UI" w:cs="Segoe UI"/>
+          <w:b w:val="0"/>
+          <w:bCs w:val="0"/>
+          <w:i w:val="0"/>
+          <w:iCs w:val="0"/>
+          <w:caps w:val="0"/>
+          <w:smallCaps w:val="0"/>
+          <w:noProof w:val="0"/>
+          <w:color w:val="auto"/>
+          <w:sz w:val="19"/>
+          <w:szCs w:val="19"/>
+          <w:lang w:val="en-US"/>
+        </w:rPr>
+        <w:t xml:space="preserve">Wanted to </w:t>
+      </w:r>
+      <w:r>
+        <w:rPr>
+          <w:rFonts w:ascii="Segoe UI" w:hAnsi="Segoe UI" w:eastAsia="Segoe UI" w:cs="Segoe UI"/>
+          <w:b w:val="0"/>
+          <w:bCs w:val="0"/>
+          <w:i w:val="0"/>
+          <w:iCs w:val="0"/>
+          <w:caps w:val="0"/>
+          <w:smallCaps w:val="0"/>
+          <w:noProof w:val="0"/>
+          <w:color w:val="auto"/>
+          <w:sz w:val="19"/>
+          <w:szCs w:val="19"/>
+          <w:lang w:val="en-US"/>
+        </w:rPr>
+        <w:t xml:space="preserve">see </w:t>
+      </w:r>
+      <w:r>
+        <w:rPr>
+          <w:rFonts w:ascii="Segoe UI" w:hAnsi="Segoe UI" w:eastAsia="Segoe UI" w:cs="Segoe UI"/>
+          <w:b w:val="0"/>
+          <w:bCs w:val="0"/>
+          <w:i w:val="0"/>
+          <w:iCs w:val="0"/>
+          <w:caps w:val="0"/>
+          <w:smallCaps w:val="0"/>
+          <w:noProof w:val="0"/>
+          <w:color w:val="auto"/>
+          <w:sz w:val="19"/>
+          <w:szCs w:val="19"/>
+          <w:lang w:val="en-US"/>
+        </w:rPr>
+        <w:t xml:space="preserve">how the AI would create the website/application </w:t>
+      </w:r>
+      <w:r>
+        <w:rPr>
+          <w:rFonts w:ascii="Segoe UI" w:hAnsi="Segoe UI" w:eastAsia="Segoe UI" w:cs="Segoe UI"/>
+          <w:b w:val="0"/>
+          <w:bCs w:val="0"/>
+          <w:i w:val="0"/>
+          <w:iCs w:val="0"/>
+          <w:caps w:val="0"/>
+          <w:smallCaps w:val="0"/>
+          <w:noProof w:val="0"/>
+          <w:color w:val="auto"/>
+          <w:sz w:val="19"/>
+          <w:szCs w:val="19"/>
+          <w:lang w:val="en-US"/>
+        </w:rPr>
+        <w:t xml:space="preserve">with our first prompt </w:t>
+      </w:r>
+      <w:r>
+        <w:rPr>
+          <w:rFonts w:ascii="Segoe UI" w:hAnsi="Segoe UI" w:eastAsia="Segoe UI" w:cs="Segoe UI"/>
+          <w:b w:val="0"/>
+          <w:bCs w:val="0"/>
+          <w:i w:val="0"/>
+          <w:iCs w:val="0"/>
+          <w:caps w:val="0"/>
+          <w:smallCaps w:val="0"/>
+          <w:noProof w:val="0"/>
+          <w:color w:val="auto"/>
+          <w:sz w:val="19"/>
+          <w:szCs w:val="19"/>
+          <w:lang w:val="en-US"/>
+        </w:rPr>
+        <w:t xml:space="preserve">and then further </w:t>
+      </w:r>
+      <w:r>
+        <w:rPr>
+          <w:rFonts w:ascii="Segoe UI" w:hAnsi="Segoe UI" w:eastAsia="Segoe UI" w:cs="Segoe UI"/>
+          <w:b w:val="0"/>
+          <w:bCs w:val="0"/>
+          <w:i w:val="0"/>
+          <w:iCs w:val="0"/>
+          <w:caps w:val="0"/>
+          <w:smallCaps w:val="0"/>
+          <w:noProof w:val="0"/>
+          <w:color w:val="auto"/>
+          <w:sz w:val="19"/>
+          <w:szCs w:val="19"/>
+          <w:lang w:val="en-US"/>
+        </w:rPr>
+        <w:t xml:space="preserve">tweak its first design with more prompts to get the </w:t>
+      </w:r>
+      <w:r>
+        <w:rPr>
+          <w:rFonts w:ascii="Segoe UI" w:hAnsi="Segoe UI" w:eastAsia="Segoe UI" w:cs="Segoe UI"/>
+          <w:b w:val="0"/>
+          <w:bCs w:val="0"/>
+          <w:i w:val="0"/>
+          <w:iCs w:val="0"/>
+          <w:caps w:val="0"/>
+          <w:smallCaps w:val="0"/>
+          <w:noProof w:val="0"/>
+          <w:color w:val="auto"/>
+          <w:sz w:val="19"/>
+          <w:szCs w:val="19"/>
+          <w:lang w:val="en-US"/>
+        </w:rPr>
+        <w:t xml:space="preserve">result we wanted. </w:t>
+      </w:r>
+    </w:p>
+    <w:p>
+      <w:pPr>
+        <w:spacing w:before="0" w:beforeAutospacing="off" w:after="240" w:afterAutospacing="off"/>
+        <w:rPr>
+          <w:rFonts w:ascii="Segoe UI" w:hAnsi="Segoe UI" w:eastAsia="Segoe UI" w:cs="Segoe UI"/>
+          <w:b w:val="1"/>
+          <w:bCs w:val="1"/>
+          <w:i w:val="0"/>
+          <w:iCs w:val="0"/>
+          <w:caps w:val="0"/>
+          <w:smallCaps w:val="0"/>
+          <w:noProof w:val="0"/>
+          <w:color w:val="auto"/>
+          <w:sz w:val="20"/>
+          <w:szCs w:val="20"/>
+          <w:lang w:val="en-US"/>
+        </w:rPr>
+      </w:pPr>
+      <w:r>
+        <w:rPr>
+          <w:rFonts w:ascii="Segoe UI" w:hAnsi="Segoe UI" w:eastAsia="Segoe UI" w:cs="Segoe UI"/>
+          <w:b w:val="1"/>
+          <w:bCs w:val="1"/>
+          <w:i w:val="0"/>
+          <w:iCs w:val="0"/>
+          <w:caps w:val="0"/>
+          <w:smallCaps w:val="0"/>
+          <w:noProof w:val="0"/>
+          <w:color w:val="auto"/>
+          <w:sz w:val="20"/>
+          <w:szCs w:val="20"/>
           <w:lang w:val="en-US"/>
         </w:rPr>
         <w:t>Prompt:</w:t>
@@ -780,6 +997,61 @@
     </w:p>
     <w:p>
       <w:pPr>
+        <w:spacing w:before="0" w:beforeAutospacing="off" w:after="0" w:afterAutospacing="off"/>
+        <w:rPr>
+          <w:rFonts w:ascii="Segoe UI" w:hAnsi="Segoe UI" w:eastAsia="Segoe UI" w:cs="Segoe UI"/>
+          <w:b w:val="1"/>
+          <w:bCs w:val="1"/>
+          <w:i w:val="0"/>
+          <w:iCs w:val="0"/>
+          <w:caps w:val="0"/>
+          <w:smallCaps w:val="0"/>
+          <w:noProof w:val="0"/>
+          <w:color w:val="auto"/>
+          <w:sz w:val="19"/>
+          <w:szCs w:val="19"/>
+          <w:lang w:val="en-US"/>
+        </w:rPr>
+      </w:pPr>
+      <w:r>
+        <w:rPr>
+          <w:rFonts w:ascii="Segoe UI" w:hAnsi="Segoe UI" w:eastAsia="Segoe UI" w:cs="Segoe UI"/>
+          <w:b w:val="1"/>
+          <w:bCs w:val="1"/>
+          <w:i w:val="0"/>
+          <w:iCs w:val="0"/>
+          <w:caps w:val="0"/>
+          <w:smallCaps w:val="0"/>
+          <w:noProof w:val="0"/>
+          <w:color w:val="auto"/>
+          <w:sz w:val="19"/>
+          <w:szCs w:val="19"/>
+          <w:lang w:val="en-US"/>
+        </w:rPr>
+        <w:t>Changes:</w:t>
+      </w:r>
+    </w:p>
+    <w:p>
+      <w:pPr>
+        <w:spacing w:before="0" w:beforeAutospacing="off" w:after="0" w:afterAutospacing="off"/>
+        <w:rPr>
+          <w:rFonts w:ascii="Segoe UI" w:hAnsi="Segoe UI" w:eastAsia="Segoe UI" w:cs="Segoe UI"/>
+          <w:b w:val="0"/>
+          <w:bCs w:val="0"/>
+          <w:i w:val="0"/>
+          <w:iCs w:val="0"/>
+          <w:caps w:val="0"/>
+          <w:smallCaps w:val="0"/>
+          <w:noProof w:val="0"/>
+          <w:color w:val="auto"/>
+          <w:sz w:val="19"/>
+          <w:szCs w:val="19"/>
+          <w:lang w:val="en-US"/>
+        </w:rPr>
+      </w:pPr>
+    </w:p>
+    <w:p>
+      <w:pPr>
         <w:pStyle w:val="Normal"/>
         <w:spacing w:before="0" w:beforeAutospacing="off" w:after="0" w:afterAutospacing="off"/>
       </w:pPr>
@@ -1370,10 +1642,845 @@
       <w:pPr>
         <w:pStyle w:val="Normal"/>
         <w:spacing w:before="0" w:beforeAutospacing="off" w:after="0" w:afterAutospacing="off"/>
-        <w:rPr>
-          <w:rFonts w:ascii="Segoe UI" w:hAnsi="Segoe UI" w:eastAsia="Segoe UI" w:cs="Segoe UI"/>
-          <w:b w:val="0"/>
-          <w:bCs w:val="0"/>
+      </w:pPr>
+      <w:r>
+        <w:rPr>
+          <w:rFonts w:ascii="Segoe UI" w:hAnsi="Segoe UI" w:eastAsia="Segoe UI" w:cs="Segoe UI"/>
+          <w:b w:val="1"/>
+          <w:bCs w:val="1"/>
+          <w:i w:val="0"/>
+          <w:iCs w:val="0"/>
+          <w:caps w:val="0"/>
+          <w:smallCaps w:val="0"/>
+          <w:noProof w:val="0"/>
+          <w:color w:val="auto"/>
+          <w:sz w:val="19"/>
+          <w:szCs w:val="19"/>
+          <w:lang w:val="en-US"/>
+        </w:rPr>
+        <w:t>20/4/26</w:t>
+      </w:r>
+      <w:r>
+        <w:rPr>
+          <w:rFonts w:ascii="Segoe UI" w:hAnsi="Segoe UI" w:eastAsia="Segoe UI" w:cs="Segoe UI"/>
+          <w:b w:val="1"/>
+          <w:bCs w:val="1"/>
+          <w:i w:val="0"/>
+          <w:iCs w:val="0"/>
+          <w:caps w:val="0"/>
+          <w:smallCaps w:val="0"/>
+          <w:noProof w:val="0"/>
+          <w:color w:val="auto"/>
+          <w:sz w:val="19"/>
+          <w:szCs w:val="19"/>
+          <w:lang w:val="en-US"/>
+        </w:rPr>
+        <w:t xml:space="preserve"> </w:t>
+      </w:r>
+    </w:p>
+    <w:p>
+      <w:pPr>
+        <w:pStyle w:val="Normal"/>
+        <w:spacing w:before="0" w:beforeAutospacing="off" w:after="0" w:afterAutospacing="off"/>
+        <w:rPr>
+          <w:rFonts w:ascii="Segoe UI" w:hAnsi="Segoe UI" w:eastAsia="Segoe UI" w:cs="Segoe UI"/>
+          <w:b w:val="1"/>
+          <w:bCs w:val="1"/>
+          <w:i w:val="0"/>
+          <w:iCs w:val="0"/>
+          <w:caps w:val="0"/>
+          <w:smallCaps w:val="0"/>
+          <w:noProof w:val="0"/>
+          <w:color w:val="FF0000"/>
+          <w:sz w:val="19"/>
+          <w:szCs w:val="19"/>
+          <w:lang w:val="en-US"/>
+        </w:rPr>
+      </w:pPr>
+      <w:r>
+        <w:rPr>
+          <w:rFonts w:ascii="Segoe UI" w:hAnsi="Segoe UI" w:eastAsia="Segoe UI" w:cs="Segoe UI"/>
+          <w:b w:val="1"/>
+          <w:bCs w:val="1"/>
+          <w:i w:val="0"/>
+          <w:iCs w:val="0"/>
+          <w:caps w:val="0"/>
+          <w:smallCaps w:val="0"/>
+          <w:noProof w:val="0"/>
+          <w:color w:val="FF0000"/>
+          <w:sz w:val="19"/>
+          <w:szCs w:val="19"/>
+          <w:lang w:val="en-US"/>
+        </w:rPr>
+        <w:t>Tool: Google Gemini</w:t>
+      </w:r>
+    </w:p>
+    <w:p>
+      <w:pPr>
+        <w:pStyle w:val="Normal"/>
+        <w:spacing w:before="0" w:beforeAutospacing="off" w:after="0" w:afterAutospacing="off"/>
+        <w:rPr>
+          <w:rFonts w:ascii="Segoe UI" w:hAnsi="Segoe UI" w:eastAsia="Segoe UI" w:cs="Segoe UI"/>
+          <w:b w:val="0"/>
+          <w:bCs w:val="0"/>
+          <w:i w:val="0"/>
+          <w:iCs w:val="0"/>
+          <w:caps w:val="0"/>
+          <w:smallCaps w:val="0"/>
+          <w:noProof w:val="0"/>
+          <w:color w:val="auto"/>
+          <w:sz w:val="19"/>
+          <w:szCs w:val="19"/>
+          <w:lang w:val="en-US"/>
+        </w:rPr>
+      </w:pPr>
+    </w:p>
+    <w:p>
+      <w:pPr>
+        <w:pStyle w:val="Normal"/>
+        <w:spacing w:before="0" w:beforeAutospacing="off" w:after="0" w:afterAutospacing="off"/>
+      </w:pPr>
+      <w:r>
+        <w:rPr>
+          <w:rFonts w:ascii="Segoe UI" w:hAnsi="Segoe UI" w:eastAsia="Segoe UI" w:cs="Segoe UI"/>
+          <w:b w:val="0"/>
+          <w:bCs w:val="0"/>
+          <w:i w:val="0"/>
+          <w:iCs w:val="0"/>
+          <w:caps w:val="0"/>
+          <w:smallCaps w:val="0"/>
+          <w:noProof w:val="0"/>
+          <w:color w:val="auto"/>
+          <w:sz w:val="19"/>
+          <w:szCs w:val="19"/>
+          <w:lang w:val="en-US"/>
+        </w:rPr>
+        <w:t>Prompt:</w:t>
+      </w:r>
+    </w:p>
+    <w:p>
+      <w:pPr>
+        <w:pStyle w:val="Normal"/>
+        <w:spacing w:before="240" w:beforeAutospacing="off" w:after="240" w:afterAutospacing="off"/>
+      </w:pPr>
+      <w:r>
+        <w:rPr>
+          <w:rFonts w:ascii="Segoe UI" w:hAnsi="Segoe UI" w:eastAsia="Segoe UI" w:cs="Segoe UI"/>
+          <w:b w:val="0"/>
+          <w:bCs w:val="0"/>
+          <w:i w:val="0"/>
+          <w:iCs w:val="0"/>
+          <w:caps w:val="0"/>
+          <w:smallCaps w:val="0"/>
+          <w:noProof w:val="0"/>
+          <w:color w:val="auto"/>
+          <w:sz w:val="19"/>
+          <w:szCs w:val="19"/>
+          <w:lang w:val="en-US"/>
+        </w:rPr>
+        <w:t>“</w:t>
+      </w:r>
+      <w:r>
+        <w:rPr>
+          <w:rFonts w:ascii="Segoe UI" w:hAnsi="Segoe UI" w:eastAsia="Segoe UI" w:cs="Segoe UI"/>
+          <w:noProof w:val="0"/>
+          <w:sz w:val="19"/>
+          <w:szCs w:val="19"/>
+          <w:lang w:val="en-US"/>
+        </w:rPr>
+        <w:t xml:space="preserve">The 4 pages the group wants </w:t>
+      </w:r>
+      <w:r>
+        <w:rPr>
+          <w:rFonts w:ascii="Segoe UI" w:hAnsi="Segoe UI" w:eastAsia="Segoe UI" w:cs="Segoe UI"/>
+          <w:noProof w:val="0"/>
+          <w:sz w:val="19"/>
+          <w:szCs w:val="19"/>
+          <w:lang w:val="en-US"/>
+        </w:rPr>
+        <w:t>added</w:t>
+      </w:r>
+      <w:r>
+        <w:rPr>
+          <w:rFonts w:ascii="Segoe UI" w:hAnsi="Segoe UI" w:eastAsia="Segoe UI" w:cs="Segoe UI"/>
+          <w:noProof w:val="0"/>
+          <w:sz w:val="19"/>
+          <w:szCs w:val="19"/>
+          <w:lang w:val="en-US"/>
+        </w:rPr>
+        <w:t xml:space="preserve"> to the website </w:t>
+      </w:r>
+      <w:r>
+        <w:rPr>
+          <w:rFonts w:ascii="Segoe UI" w:hAnsi="Segoe UI" w:eastAsia="Segoe UI" w:cs="Segoe UI"/>
+          <w:noProof w:val="0"/>
+          <w:sz w:val="19"/>
+          <w:szCs w:val="19"/>
+          <w:lang w:val="en-US"/>
+        </w:rPr>
+        <w:t>is</w:t>
+      </w:r>
+      <w:r>
+        <w:rPr>
+          <w:rFonts w:ascii="Segoe UI" w:hAnsi="Segoe UI" w:eastAsia="Segoe UI" w:cs="Segoe UI"/>
+          <w:noProof w:val="0"/>
+          <w:sz w:val="19"/>
+          <w:szCs w:val="19"/>
+          <w:lang w:val="en-US"/>
+        </w:rPr>
+        <w:t xml:space="preserve"> a timetable, canteen menu, a </w:t>
+      </w:r>
+      <w:r>
+        <w:rPr>
+          <w:rFonts w:ascii="Segoe UI" w:hAnsi="Segoe UI" w:eastAsia="Segoe UI" w:cs="Segoe UI"/>
+          <w:noProof w:val="0"/>
+          <w:sz w:val="19"/>
+          <w:szCs w:val="19"/>
+          <w:lang w:val="en-US"/>
+        </w:rPr>
+        <w:t>map</w:t>
+      </w:r>
+      <w:r>
+        <w:rPr>
+          <w:rFonts w:ascii="Segoe UI" w:hAnsi="Segoe UI" w:eastAsia="Segoe UI" w:cs="Segoe UI"/>
+          <w:noProof w:val="0"/>
+          <w:sz w:val="19"/>
+          <w:szCs w:val="19"/>
+          <w:lang w:val="en-US"/>
+        </w:rPr>
+        <w:t xml:space="preserve"> and a lost found page. </w:t>
+      </w:r>
+      <w:r>
+        <w:rPr>
+          <w:rFonts w:ascii="Segoe UI" w:hAnsi="Segoe UI" w:eastAsia="Segoe UI" w:cs="Segoe UI"/>
+          <w:noProof w:val="0"/>
+          <w:sz w:val="19"/>
+          <w:szCs w:val="19"/>
+          <w:lang w:val="en-US"/>
+        </w:rPr>
+        <w:t xml:space="preserve">Use 1 font for the entire page, preferably "Roboto" from google fonts. </w:t>
+      </w:r>
+    </w:p>
+    <w:p>
+      <w:pPr>
+        <w:spacing w:before="240" w:beforeAutospacing="off" w:after="240" w:afterAutospacing="off"/>
+      </w:pPr>
+      <w:r>
+        <w:rPr>
+          <w:rFonts w:ascii="Segoe UI" w:hAnsi="Segoe UI" w:eastAsia="Segoe UI" w:cs="Segoe UI"/>
+          <w:noProof w:val="0"/>
+          <w:sz w:val="19"/>
+          <w:szCs w:val="19"/>
+          <w:lang w:val="en-US"/>
+        </w:rPr>
+        <w:t xml:space="preserve">All the information should be FAKE AND </w:t>
+      </w:r>
+      <w:r>
+        <w:rPr>
+          <w:rFonts w:ascii="Segoe UI" w:hAnsi="Segoe UI" w:eastAsia="Segoe UI" w:cs="Segoe UI"/>
+          <w:noProof w:val="0"/>
+          <w:sz w:val="19"/>
+          <w:szCs w:val="19"/>
+          <w:lang w:val="en-US"/>
+        </w:rPr>
+        <w:t>MADE UP</w:t>
+      </w:r>
+      <w:r>
+        <w:rPr>
+          <w:rFonts w:ascii="Segoe UI" w:hAnsi="Segoe UI" w:eastAsia="Segoe UI" w:cs="Segoe UI"/>
+          <w:noProof w:val="0"/>
+          <w:sz w:val="19"/>
+          <w:szCs w:val="19"/>
+          <w:lang w:val="en-US"/>
+        </w:rPr>
+        <w:t xml:space="preserve"> including names of locations, names of students (if they are needed on any of the pages to be used as an example), contact information including emails and phone numbers. </w:t>
+      </w:r>
+    </w:p>
+    <w:p>
+      <w:pPr>
+        <w:spacing w:before="240" w:beforeAutospacing="off" w:after="240" w:afterAutospacing="off"/>
+      </w:pPr>
+      <w:r>
+        <w:rPr>
+          <w:rFonts w:ascii="Segoe UI" w:hAnsi="Segoe UI" w:eastAsia="Segoe UI" w:cs="Segoe UI"/>
+          <w:noProof w:val="0"/>
+          <w:sz w:val="19"/>
+          <w:szCs w:val="19"/>
+          <w:lang w:val="en-US"/>
+        </w:rPr>
+        <w:t xml:space="preserve">Accessibility should be a top </w:t>
+      </w:r>
+      <w:r>
+        <w:rPr>
+          <w:rFonts w:ascii="Segoe UI" w:hAnsi="Segoe UI" w:eastAsia="Segoe UI" w:cs="Segoe UI"/>
+          <w:noProof w:val="0"/>
+          <w:sz w:val="19"/>
+          <w:szCs w:val="19"/>
+          <w:lang w:val="en-US"/>
+        </w:rPr>
+        <w:t>priority</w:t>
+      </w:r>
+      <w:r>
+        <w:rPr>
+          <w:rFonts w:ascii="Segoe UI" w:hAnsi="Segoe UI" w:eastAsia="Segoe UI" w:cs="Segoe UI"/>
+          <w:noProof w:val="0"/>
+          <w:sz w:val="19"/>
+          <w:szCs w:val="19"/>
+          <w:lang w:val="en-US"/>
+        </w:rPr>
+        <w:t xml:space="preserve"> and the website should be user friendly. Change the </w:t>
+      </w:r>
+      <w:r>
+        <w:rPr>
+          <w:rFonts w:ascii="Segoe UI" w:hAnsi="Segoe UI" w:eastAsia="Segoe UI" w:cs="Segoe UI"/>
+          <w:noProof w:val="0"/>
+          <w:sz w:val="19"/>
+          <w:szCs w:val="19"/>
+          <w:lang w:val="en-US"/>
+        </w:rPr>
+        <w:t>colour</w:t>
+      </w:r>
+      <w:r>
+        <w:rPr>
+          <w:rFonts w:ascii="Segoe UI" w:hAnsi="Segoe UI" w:eastAsia="Segoe UI" w:cs="Segoe UI"/>
+          <w:noProof w:val="0"/>
+          <w:sz w:val="19"/>
+          <w:szCs w:val="19"/>
+          <w:lang w:val="en-US"/>
+        </w:rPr>
+        <w:t xml:space="preserve"> scheme of the entire website to be white and blue, just use appealing </w:t>
+      </w:r>
+      <w:r>
+        <w:rPr>
+          <w:rFonts w:ascii="Segoe UI" w:hAnsi="Segoe UI" w:eastAsia="Segoe UI" w:cs="Segoe UI"/>
+          <w:noProof w:val="0"/>
+          <w:sz w:val="19"/>
+          <w:szCs w:val="19"/>
+          <w:lang w:val="en-US"/>
+        </w:rPr>
+        <w:t>colours</w:t>
+      </w:r>
+      <w:r>
+        <w:rPr>
+          <w:rFonts w:ascii="Segoe UI" w:hAnsi="Segoe UI" w:eastAsia="Segoe UI" w:cs="Segoe UI"/>
+          <w:noProof w:val="0"/>
+          <w:sz w:val="19"/>
+          <w:szCs w:val="19"/>
+          <w:lang w:val="en-US"/>
+        </w:rPr>
+        <w:t xml:space="preserve"> that's suitable for a college based application, all text throughout should be visible including in text boxes where the user has to input something, add a footer containing useful information where students can easily navigate to. The image </w:t>
+      </w:r>
+      <w:r>
+        <w:rPr>
+          <w:rFonts w:ascii="Segoe UI" w:hAnsi="Segoe UI" w:eastAsia="Segoe UI" w:cs="Segoe UI"/>
+          <w:noProof w:val="0"/>
+          <w:sz w:val="19"/>
+          <w:szCs w:val="19"/>
+          <w:lang w:val="en-US"/>
+        </w:rPr>
+        <w:t>i</w:t>
+      </w:r>
+      <w:r>
+        <w:rPr>
+          <w:rFonts w:ascii="Segoe UI" w:hAnsi="Segoe UI" w:eastAsia="Segoe UI" w:cs="Segoe UI"/>
+          <w:noProof w:val="0"/>
+          <w:sz w:val="19"/>
+          <w:szCs w:val="19"/>
+          <w:lang w:val="en-US"/>
+        </w:rPr>
+        <w:t xml:space="preserve"> provided can be used as a background picture on the home page. When creating buttons throughout the site, they should all be visible, </w:t>
+      </w:r>
+      <w:r>
+        <w:rPr>
+          <w:rFonts w:ascii="Segoe UI" w:hAnsi="Segoe UI" w:eastAsia="Segoe UI" w:cs="Segoe UI"/>
+          <w:noProof w:val="0"/>
+          <w:sz w:val="19"/>
+          <w:szCs w:val="19"/>
+          <w:lang w:val="en-US"/>
+        </w:rPr>
+        <w:t>interactive</w:t>
+      </w:r>
+      <w:r>
+        <w:rPr>
+          <w:rFonts w:ascii="Segoe UI" w:hAnsi="Segoe UI" w:eastAsia="Segoe UI" w:cs="Segoe UI"/>
+          <w:noProof w:val="0"/>
+          <w:sz w:val="19"/>
+          <w:szCs w:val="19"/>
+          <w:lang w:val="en-US"/>
+        </w:rPr>
+        <w:t xml:space="preserve"> and have a light animation </w:t>
+      </w:r>
+      <w:r>
+        <w:rPr>
+          <w:rFonts w:ascii="Segoe UI" w:hAnsi="Segoe UI" w:eastAsia="Segoe UI" w:cs="Segoe UI"/>
+          <w:noProof w:val="0"/>
+          <w:sz w:val="19"/>
+          <w:szCs w:val="19"/>
+          <w:lang w:val="en-US"/>
+        </w:rPr>
+        <w:t>to</w:t>
+      </w:r>
+      <w:r>
+        <w:rPr>
+          <w:rFonts w:ascii="Segoe UI" w:hAnsi="Segoe UI" w:eastAsia="Segoe UI" w:cs="Segoe UI"/>
+          <w:noProof w:val="0"/>
+          <w:sz w:val="19"/>
+          <w:szCs w:val="19"/>
+          <w:lang w:val="en-US"/>
+        </w:rPr>
+        <w:t xml:space="preserve"> them. </w:t>
+      </w:r>
+    </w:p>
+    <w:p>
+      <w:pPr>
+        <w:spacing w:before="240" w:beforeAutospacing="off" w:after="240" w:afterAutospacing="off"/>
+      </w:pPr>
+      <w:r>
+        <w:rPr>
+          <w:rFonts w:ascii="Segoe UI" w:hAnsi="Segoe UI" w:eastAsia="Segoe UI" w:cs="Segoe UI"/>
+          <w:noProof w:val="0"/>
+          <w:sz w:val="19"/>
+          <w:szCs w:val="19"/>
+          <w:lang w:val="en-US"/>
+        </w:rPr>
+        <w:t xml:space="preserve">For the timetable, have a schedule for Monday to Friday, the times for these days can vary from 9am to 4pm, switch it up a little but have a 9am to 4pm 2 days a week and you can decide what times the other 3 days should be and how they should be broken up into. Add in 4 groups, 1 to 4, giving them different schedules. Give each group a different module. The layout should be simple, easy to navigate for </w:t>
+      </w:r>
+      <w:r>
+        <w:rPr>
+          <w:rFonts w:ascii="Segoe UI" w:hAnsi="Segoe UI" w:eastAsia="Segoe UI" w:cs="Segoe UI"/>
+          <w:noProof w:val="0"/>
+          <w:sz w:val="19"/>
+          <w:szCs w:val="19"/>
+          <w:lang w:val="en-US"/>
+        </w:rPr>
+        <w:t>students</w:t>
+      </w:r>
+      <w:r>
+        <w:rPr>
+          <w:rFonts w:ascii="Segoe UI" w:hAnsi="Segoe UI" w:eastAsia="Segoe UI" w:cs="Segoe UI"/>
+          <w:noProof w:val="0"/>
+          <w:sz w:val="19"/>
+          <w:szCs w:val="19"/>
+          <w:lang w:val="en-US"/>
+        </w:rPr>
+        <w:t xml:space="preserve"> and have everything labelled. </w:t>
+      </w:r>
+    </w:p>
+    <w:p>
+      <w:pPr>
+        <w:spacing w:before="240" w:beforeAutospacing="off" w:after="240" w:afterAutospacing="off"/>
+      </w:pPr>
+      <w:r>
+        <w:rPr>
+          <w:rFonts w:ascii="Segoe UI" w:hAnsi="Segoe UI" w:eastAsia="Segoe UI" w:cs="Segoe UI"/>
+          <w:noProof w:val="0"/>
+          <w:sz w:val="19"/>
+          <w:szCs w:val="19"/>
+          <w:lang w:val="en-US"/>
+        </w:rPr>
+        <w:t xml:space="preserve">For the map, this should be a blueprint of a </w:t>
+      </w:r>
+      <w:r>
+        <w:rPr>
+          <w:rFonts w:ascii="Segoe UI" w:hAnsi="Segoe UI" w:eastAsia="Segoe UI" w:cs="Segoe UI"/>
+          <w:noProof w:val="0"/>
+          <w:sz w:val="19"/>
+          <w:szCs w:val="19"/>
+          <w:lang w:val="en-US"/>
+        </w:rPr>
+        <w:t>made up</w:t>
+      </w:r>
+      <w:r>
+        <w:rPr>
+          <w:rFonts w:ascii="Segoe UI" w:hAnsi="Segoe UI" w:eastAsia="Segoe UI" w:cs="Segoe UI"/>
+          <w:noProof w:val="0"/>
+          <w:sz w:val="19"/>
+          <w:szCs w:val="19"/>
+          <w:lang w:val="en-US"/>
+        </w:rPr>
+        <w:t xml:space="preserve"> university building with a birds-eye </w:t>
+      </w:r>
+      <w:r>
+        <w:rPr>
+          <w:rFonts w:ascii="Segoe UI" w:hAnsi="Segoe UI" w:eastAsia="Segoe UI" w:cs="Segoe UI"/>
+          <w:noProof w:val="0"/>
+          <w:sz w:val="19"/>
+          <w:szCs w:val="19"/>
+          <w:lang w:val="en-US"/>
+        </w:rPr>
+        <w:t>view,</w:t>
+      </w:r>
+      <w:r>
+        <w:rPr>
+          <w:rFonts w:ascii="Segoe UI" w:hAnsi="Segoe UI" w:eastAsia="Segoe UI" w:cs="Segoe UI"/>
+          <w:noProof w:val="0"/>
+          <w:sz w:val="19"/>
+          <w:szCs w:val="19"/>
+          <w:lang w:val="en-US"/>
+        </w:rPr>
+        <w:t xml:space="preserve"> it should label building names with markers (an inverse water droplet) for example or something similar to google maps. It should be able to zoom in and out using an interactive slider on the side or by scroll </w:t>
+      </w:r>
+      <w:r>
+        <w:rPr>
+          <w:rFonts w:ascii="Segoe UI" w:hAnsi="Segoe UI" w:eastAsia="Segoe UI" w:cs="Segoe UI"/>
+          <w:noProof w:val="0"/>
+          <w:sz w:val="19"/>
+          <w:szCs w:val="19"/>
+          <w:lang w:val="en-US"/>
+        </w:rPr>
+        <w:t>wheel,</w:t>
+      </w:r>
+      <w:r>
+        <w:rPr>
+          <w:rFonts w:ascii="Segoe UI" w:hAnsi="Segoe UI" w:eastAsia="Segoe UI" w:cs="Segoe UI"/>
+          <w:noProof w:val="0"/>
+          <w:sz w:val="19"/>
+          <w:szCs w:val="19"/>
+          <w:lang w:val="en-US"/>
+        </w:rPr>
+        <w:t xml:space="preserve"> it should also have a legend having everything neatly labelled. You should also be able to move and look around the map by holding your mouse button. </w:t>
+      </w:r>
+    </w:p>
+    <w:p>
+      <w:pPr>
+        <w:spacing w:before="240" w:beforeAutospacing="off" w:after="240" w:afterAutospacing="off"/>
+      </w:pPr>
+      <w:r>
+        <w:rPr>
+          <w:rFonts w:ascii="Segoe UI" w:hAnsi="Segoe UI" w:eastAsia="Segoe UI" w:cs="Segoe UI"/>
+          <w:noProof w:val="0"/>
+          <w:sz w:val="19"/>
+          <w:szCs w:val="19"/>
+          <w:lang w:val="en-US"/>
+        </w:rPr>
+        <w:t xml:space="preserve">For the canteen menu, it should display a basic menu </w:t>
+      </w:r>
+      <w:r>
+        <w:rPr>
+          <w:rFonts w:ascii="Segoe UI" w:hAnsi="Segoe UI" w:eastAsia="Segoe UI" w:cs="Segoe UI"/>
+          <w:noProof w:val="0"/>
+          <w:sz w:val="19"/>
+          <w:szCs w:val="19"/>
+          <w:lang w:val="en-US"/>
+        </w:rPr>
+        <w:t>thats</w:t>
+      </w:r>
+      <w:r>
+        <w:rPr>
+          <w:rFonts w:ascii="Segoe UI" w:hAnsi="Segoe UI" w:eastAsia="Segoe UI" w:cs="Segoe UI"/>
+          <w:noProof w:val="0"/>
+          <w:sz w:val="19"/>
+          <w:szCs w:val="19"/>
+          <w:lang w:val="en-US"/>
+        </w:rPr>
+        <w:t xml:space="preserve"> available </w:t>
+      </w:r>
+      <w:r>
+        <w:rPr>
+          <w:rFonts w:ascii="Segoe UI" w:hAnsi="Segoe UI" w:eastAsia="Segoe UI" w:cs="Segoe UI"/>
+          <w:noProof w:val="0"/>
+          <w:sz w:val="19"/>
+          <w:szCs w:val="19"/>
+          <w:lang w:val="en-US"/>
+        </w:rPr>
+        <w:t>everyday</w:t>
+      </w:r>
+      <w:r>
+        <w:rPr>
+          <w:rFonts w:ascii="Segoe UI" w:hAnsi="Segoe UI" w:eastAsia="Segoe UI" w:cs="Segoe UI"/>
+          <w:noProof w:val="0"/>
+          <w:sz w:val="19"/>
+          <w:szCs w:val="19"/>
+          <w:lang w:val="en-US"/>
+        </w:rPr>
+        <w:t xml:space="preserve"> from Monday to Friday and also have a special menu that changes every day. </w:t>
+      </w:r>
+      <w:r>
+        <w:rPr>
+          <w:rFonts w:ascii="Segoe UI" w:hAnsi="Segoe UI" w:eastAsia="Segoe UI" w:cs="Segoe UI"/>
+          <w:noProof w:val="0"/>
+          <w:sz w:val="19"/>
+          <w:szCs w:val="19"/>
+          <w:lang w:val="en-US"/>
+        </w:rPr>
+        <w:t>The special menu should be smaller in size compared to the basic one.</w:t>
+      </w:r>
+      <w:r>
+        <w:rPr>
+          <w:rFonts w:ascii="Segoe UI" w:hAnsi="Segoe UI" w:eastAsia="Segoe UI" w:cs="Segoe UI"/>
+          <w:noProof w:val="0"/>
+          <w:sz w:val="19"/>
+          <w:szCs w:val="19"/>
+          <w:lang w:val="en-US"/>
+        </w:rPr>
+        <w:t xml:space="preserve"> </w:t>
+      </w:r>
+      <w:r>
+        <w:rPr>
+          <w:rFonts w:ascii="Segoe UI" w:hAnsi="Segoe UI" w:eastAsia="Segoe UI" w:cs="Segoe UI"/>
+          <w:noProof w:val="0"/>
+          <w:sz w:val="19"/>
+          <w:szCs w:val="19"/>
+          <w:lang w:val="en-US"/>
+        </w:rPr>
+        <w:t>DIsplay</w:t>
+      </w:r>
+      <w:r>
+        <w:rPr>
+          <w:rFonts w:ascii="Segoe UI" w:hAnsi="Segoe UI" w:eastAsia="Segoe UI" w:cs="Segoe UI"/>
+          <w:noProof w:val="0"/>
+          <w:sz w:val="19"/>
+          <w:szCs w:val="19"/>
+          <w:lang w:val="en-US"/>
+        </w:rPr>
+        <w:t xml:space="preserve"> food allergens and the times that the food is available at and what time the canteen opens. It should display prices beside each food item. </w:t>
+      </w:r>
+    </w:p>
+    <w:p>
+      <w:pPr>
+        <w:spacing w:before="240" w:beforeAutospacing="off" w:after="240" w:afterAutospacing="off"/>
+      </w:pPr>
+      <w:r>
+        <w:rPr>
+          <w:rFonts w:ascii="Segoe UI" w:hAnsi="Segoe UI" w:eastAsia="Segoe UI" w:cs="Segoe UI"/>
+          <w:noProof w:val="0"/>
+          <w:sz w:val="19"/>
+          <w:szCs w:val="19"/>
+          <w:lang w:val="en-US"/>
+        </w:rPr>
+        <w:t xml:space="preserve">For the lost and found page, create a section where the student can </w:t>
+      </w:r>
+      <w:r>
+        <w:rPr>
+          <w:rFonts w:ascii="Segoe UI" w:hAnsi="Segoe UI" w:eastAsia="Segoe UI" w:cs="Segoe UI"/>
+          <w:noProof w:val="0"/>
+          <w:sz w:val="19"/>
+          <w:szCs w:val="19"/>
+          <w:lang w:val="en-US"/>
+        </w:rPr>
+        <w:t>enter in</w:t>
+      </w:r>
+      <w:r>
+        <w:rPr>
+          <w:rFonts w:ascii="Segoe UI" w:hAnsi="Segoe UI" w:eastAsia="Segoe UI" w:cs="Segoe UI"/>
+          <w:noProof w:val="0"/>
+          <w:sz w:val="19"/>
+          <w:szCs w:val="19"/>
+          <w:lang w:val="en-US"/>
+        </w:rPr>
+        <w:t xml:space="preserve"> their details and provide info on their lost item with a submit button. The main section of this page should list all the lost items with contact information under </w:t>
+      </w:r>
+      <w:r>
+        <w:rPr>
+          <w:rFonts w:ascii="Segoe UI" w:hAnsi="Segoe UI" w:eastAsia="Segoe UI" w:cs="Segoe UI"/>
+          <w:noProof w:val="0"/>
+          <w:sz w:val="19"/>
+          <w:szCs w:val="19"/>
+          <w:lang w:val="en-US"/>
+        </w:rPr>
+        <w:t>it</w:t>
+      </w:r>
+      <w:r>
+        <w:rPr>
+          <w:rFonts w:ascii="Segoe UI" w:hAnsi="Segoe UI" w:eastAsia="Segoe UI" w:cs="Segoe UI"/>
+          <w:noProof w:val="0"/>
+          <w:sz w:val="19"/>
+          <w:szCs w:val="19"/>
+          <w:lang w:val="en-US"/>
+        </w:rPr>
+        <w:t xml:space="preserve"> so students know who to contact. This information should be fake and made </w:t>
+      </w:r>
+      <w:r>
+        <w:rPr>
+          <w:rFonts w:ascii="Segoe UI" w:hAnsi="Segoe UI" w:eastAsia="Segoe UI" w:cs="Segoe UI"/>
+          <w:noProof w:val="0"/>
+          <w:sz w:val="19"/>
+          <w:szCs w:val="19"/>
+          <w:lang w:val="en-US"/>
+        </w:rPr>
+        <w:t>up</w:t>
+      </w:r>
+      <w:r>
+        <w:rPr>
+          <w:rFonts w:ascii="Segoe UI" w:hAnsi="Segoe UI" w:eastAsia="Segoe UI" w:cs="Segoe UI"/>
+          <w:noProof w:val="0"/>
+          <w:sz w:val="19"/>
+          <w:szCs w:val="19"/>
+          <w:lang w:val="en-US"/>
+        </w:rPr>
+        <w:t>.”</w:t>
+      </w:r>
+    </w:p>
+    <w:p>
+      <w:pPr>
+        <w:spacing w:before="240" w:beforeAutospacing="off" w:after="240" w:afterAutospacing="off"/>
+      </w:pPr>
+      <w:r>
+        <w:rPr>
+          <w:rFonts w:ascii="Segoe UI" w:hAnsi="Segoe UI" w:eastAsia="Segoe UI" w:cs="Segoe UI"/>
+          <w:b w:val="1"/>
+          <w:bCs w:val="1"/>
+          <w:noProof w:val="0"/>
+          <w:sz w:val="19"/>
+          <w:szCs w:val="19"/>
+          <w:lang w:val="en-US"/>
+        </w:rPr>
+        <w:t>Changes:</w:t>
+      </w:r>
+    </w:p>
+    <w:p>
+      <w:pPr>
+        <w:pStyle w:val="Normal"/>
+        <w:spacing w:before="240" w:beforeAutospacing="off" w:after="240" w:afterAutospacing="off"/>
+      </w:pPr>
+      <w:r>
+        <w:rPr>
+          <w:rFonts w:ascii="Segoe UI" w:hAnsi="Segoe UI" w:eastAsia="Segoe UI" w:cs="Segoe UI"/>
+          <w:b w:val="0"/>
+          <w:bCs w:val="0"/>
+          <w:noProof w:val="0"/>
+          <w:sz w:val="19"/>
+          <w:szCs w:val="19"/>
+          <w:lang w:val="en-US"/>
+        </w:rPr>
+        <w:t>“</w:t>
+      </w:r>
+      <w:r>
+        <w:rPr>
+          <w:rFonts w:ascii="Segoe UI" w:hAnsi="Segoe UI" w:eastAsia="Segoe UI" w:cs="Segoe UI"/>
+          <w:noProof w:val="0"/>
+          <w:sz w:val="19"/>
+          <w:szCs w:val="19"/>
+          <w:lang w:val="en-US"/>
+        </w:rPr>
+        <w:t>Can you change change the navbar to a light blue, main background of all the pages can be white, or you decide what contrast of colour suits best. Just get rid of this black dark blue navy colour scheme. "Events" should be renamed to "Student Timetable", get rid of "Zoom Controls" on the map page, add in more buildings/rooms (like labs, lecture halls, science rooms etc, make the grid on the map bigger so theres more space, add the entrance to the college too. The helpdesk does page does not load and no information is being displayed. Add in fake contact information and times when they are available online and in the college, students should be able to make a ticket as well.”</w:t>
+      </w:r>
+    </w:p>
+    <w:p>
+      <w:pPr>
+        <w:pStyle w:val="Normal"/>
+        <w:spacing w:before="240" w:beforeAutospacing="off" w:after="240" w:afterAutospacing="off"/>
+      </w:pPr>
+      <w:r>
+        <w:rPr>
+          <w:rFonts w:ascii="Segoe UI" w:hAnsi="Segoe UI" w:eastAsia="Segoe UI" w:cs="Segoe UI"/>
+          <w:noProof w:val="0"/>
+          <w:sz w:val="19"/>
+          <w:szCs w:val="19"/>
+          <w:lang w:val="en-US"/>
+        </w:rPr>
+        <w:t xml:space="preserve">“See how you marked the legend with </w:t>
+      </w:r>
+      <w:r>
+        <w:rPr>
+          <w:rFonts w:ascii="Segoe UI" w:hAnsi="Segoe UI" w:eastAsia="Segoe UI" w:cs="Segoe UI"/>
+          <w:noProof w:val="0"/>
+          <w:sz w:val="19"/>
+          <w:szCs w:val="19"/>
+          <w:lang w:val="en-US"/>
+        </w:rPr>
+        <w:t>colours</w:t>
+      </w:r>
+      <w:r>
+        <w:rPr>
+          <w:rFonts w:ascii="Segoe UI" w:hAnsi="Segoe UI" w:eastAsia="Segoe UI" w:cs="Segoe UI"/>
+          <w:noProof w:val="0"/>
+          <w:sz w:val="19"/>
+          <w:szCs w:val="19"/>
+          <w:lang w:val="en-US"/>
+        </w:rPr>
+        <w:t xml:space="preserve">, do the same with the labels on the map, make the markers smaller and </w:t>
+      </w:r>
+      <w:r>
+        <w:rPr>
+          <w:rFonts w:ascii="Segoe UI" w:hAnsi="Segoe UI" w:eastAsia="Segoe UI" w:cs="Segoe UI"/>
+          <w:noProof w:val="0"/>
+          <w:sz w:val="19"/>
+          <w:szCs w:val="19"/>
+          <w:lang w:val="en-US"/>
+        </w:rPr>
+        <w:t>colour</w:t>
+      </w:r>
+      <w:r>
+        <w:rPr>
+          <w:rFonts w:ascii="Segoe UI" w:hAnsi="Segoe UI" w:eastAsia="Segoe UI" w:cs="Segoe UI"/>
+          <w:noProof w:val="0"/>
+          <w:sz w:val="19"/>
+          <w:szCs w:val="19"/>
+          <w:lang w:val="en-US"/>
+        </w:rPr>
+        <w:t xml:space="preserve"> them based off the legend and on the correct buildings/rooms”</w:t>
+      </w:r>
+    </w:p>
+    <w:p>
+      <w:pPr>
+        <w:spacing w:before="240" w:beforeAutospacing="off" w:after="240" w:afterAutospacing="off"/>
+      </w:pPr>
+      <w:r>
+        <w:rPr>
+          <w:rFonts w:ascii="Segoe UI" w:hAnsi="Segoe UI" w:eastAsia="Segoe UI" w:cs="Segoe UI"/>
+          <w:noProof w:val="0"/>
+          <w:sz w:val="19"/>
+          <w:szCs w:val="19"/>
+          <w:lang w:val="en-US"/>
+        </w:rPr>
+        <w:t xml:space="preserve">“My lost and found page is on vs code but </w:t>
+      </w:r>
+      <w:r>
+        <w:rPr>
+          <w:rFonts w:ascii="Segoe UI" w:hAnsi="Segoe UI" w:eastAsia="Segoe UI" w:cs="Segoe UI"/>
+          <w:noProof w:val="0"/>
+          <w:sz w:val="19"/>
+          <w:szCs w:val="19"/>
+          <w:lang w:val="en-US"/>
+        </w:rPr>
+        <w:t>doesnt</w:t>
+      </w:r>
+      <w:r>
+        <w:rPr>
+          <w:rFonts w:ascii="Segoe UI" w:hAnsi="Segoe UI" w:eastAsia="Segoe UI" w:cs="Segoe UI"/>
+          <w:noProof w:val="0"/>
+          <w:sz w:val="19"/>
+          <w:szCs w:val="19"/>
+          <w:lang w:val="en-US"/>
+        </w:rPr>
+        <w:t xml:space="preserve"> display on the site”</w:t>
+      </w:r>
+    </w:p>
+    <w:p>
+      <w:pPr>
+        <w:pStyle w:val="Normal"/>
+        <w:spacing w:before="240" w:beforeAutospacing="off" w:after="240" w:afterAutospacing="off"/>
+        <w:rPr>
+          <w:rFonts w:ascii="Segoe UI" w:hAnsi="Segoe UI" w:eastAsia="Segoe UI" w:cs="Segoe UI"/>
+          <w:noProof w:val="0"/>
+          <w:sz w:val="19"/>
+          <w:szCs w:val="19"/>
+          <w:lang w:val="en-US"/>
+        </w:rPr>
+      </w:pPr>
+    </w:p>
+    <w:p>
+      <w:pPr>
+        <w:pStyle w:val="Normal"/>
+        <w:spacing w:before="240" w:beforeAutospacing="off" w:after="240" w:afterAutospacing="off"/>
+        <w:rPr>
+          <w:rFonts w:ascii="Segoe UI" w:hAnsi="Segoe UI" w:eastAsia="Segoe UI" w:cs="Segoe UI"/>
+          <w:noProof w:val="0"/>
+          <w:sz w:val="19"/>
+          <w:szCs w:val="19"/>
+          <w:lang w:val="en-US"/>
+        </w:rPr>
+      </w:pPr>
+    </w:p>
+    <w:p>
+      <w:pPr>
+        <w:pStyle w:val="Normal"/>
+        <w:spacing w:before="0" w:beforeAutospacing="off" w:after="0" w:afterAutospacing="off"/>
+        <w:rPr>
+          <w:rFonts w:ascii="Segoe UI" w:hAnsi="Segoe UI" w:eastAsia="Segoe UI" w:cs="Segoe UI"/>
+          <w:b w:val="1"/>
+          <w:bCs w:val="1"/>
           <w:i w:val="0"/>
           <w:iCs w:val="0"/>
           <w:caps w:val="0"/>
@@ -1967,7 +3074,7 @@
     <w:basedOn w:val="Normal"/>
     <w:next w:val="Normal"/>
     <w:qFormat/>
-    <w:rsid w:val="639E7821"/>
+    <w:rsid w:val="169D9CBC"/>
     <w:rPr>
       <w:rFonts w:ascii="Aptos Display" w:hAnsi="Aptos Display" w:eastAsia="" w:cs="" w:asciiTheme="majorAscii" w:hAnsiTheme="majorAscii" w:eastAsiaTheme="majorEastAsia" w:cstheme="majorBidi"/>
       <w:color w:val="0F4761" w:themeColor="accent1" w:themeTint="FF" w:themeShade="BF"/>
@@ -1986,12 +3093,23 @@
     <w:name w:val="List Paragraph"/>
     <w:basedOn w:val="Normal"/>
     <w:qFormat/>
-    <w:rsid w:val="639E7821"/>
+    <w:rsid w:val="169D9CBC"/>
     <w:pPr>
       <w:spacing/>
       <w:ind w:left="720"/>
       <w:contextualSpacing/>
     </w:pPr>
+  </w:style>
+  <w:style w:type="character" w:styleId="Hyperlink">
+    <w:uiPriority w:val="99"/>
+    <w:name w:val="Hyperlink"/>
+    <w:basedOn w:val="DefaultParagraphFont"/>
+    <w:unhideWhenUsed/>
+    <w:rsid w:val="169D9CBC"/>
+    <w:rPr>
+      <w:color w:val="467886"/>
+      <w:u w:val="single"/>
+    </w:rPr>
   </w:style>
 </w:styles>
 </file>

</xml_diff>